<commit_message>
docs: regenerate formatted weekly plan docx
Co-authored-by: Cursor <cursoragent@cursor.com>
</commit_message>
<xml_diff>
--- a/docs/updated_plan_formatted.docx
+++ b/docs/updated_plan_formatted.docx
@@ -222,7 +222,7 @@
             </w:pPr>
             <w:r/>
             <w:r>
-              <w:t>Data, hybrid XML parser, rule engine (R01–R30), Docker, datasets</w:t>
+              <w:t>Data, parser, shared rules/guidelines implementation, Docker, backend APIs</w:t>
             </w:r>
           </w:p>
         </w:tc>
@@ -290,7 +290,7 @@
             </w:pPr>
             <w:r/>
             <w:r>
-              <w:t>JSON schemas, Figma designs, React + Tailwind Axion UI, API integration</w:t>
+              <w:t>UI + schemas + shared rules/guidelines + agentic/model experiments</w:t>
             </w:r>
           </w:p>
         </w:tc>
@@ -358,7 +358,7 @@
             </w:pPr>
             <w:r/>
             <w:r>
-              <w:t>LLM agent, report generator, QA/evaluation, SRS/SDS, team coordination</w:t>
+              <w:t>Agent/report lead, shared rules/guidelines, QA/evaluation, coordination</w:t>
             </w:r>
           </w:p>
         </w:tc>
@@ -754,9 +754,9 @@
         <w:br/>
         <w:t>│   │   ├── schema_documents.py        ✅ Done</w:t>
         <w:br/>
-        <w:t>│   │   ├── rules.py                   ⬜ Week 3 (Salar)</w:t>
+        <w:t>│   │   ├── rules.py                   ⬜ Week 3–8 (Team: Salar + Ayesha + Noor)</w:t>
         <w:br/>
-        <w:t>│   │   ├── agent.py                   ⬜ Week 4 (Noor)</w:t>
+        <w:t>│   │   ├── agent.py                   ⬜ Week 4–8 (Team: Noor lead, Ayesha + Salar support)</w:t>
         <w:br/>
         <w:t>│   │   └── report.py                  ⬜ Week 5 (Noor)</w:t>
         <w:br/>
@@ -876,17 +876,340 @@
         </w:rPr>
         <w:t>Screenshot + UIAutomator XML</w:t>
         <w:br/>
-        <w:t xml:space="preserve">    → Parser (Salar)           → components.json     ✅ DONE</w:t>
+        <w:t xml:space="preserve">    → Parser (Salar lead; Noor + Ayesha support)          → components.json     ✅ DONE</w:t>
         <w:br/>
-        <w:t xml:space="preserve">    → Rule engine (Salar)      → violations.json     ⬜ Week 3–4</w:t>
+        <w:t xml:space="preserve">    → Rule engine (Team: Salar + Ayesha + Noor)           → violations.json     ⬜ Week 3–8</w:t>
         <w:br/>
-        <w:t xml:space="preserve">    → Agent (Noor)             → report.json         ⬜ Week 4–5</w:t>
+        <w:t xml:space="preserve">    → Agent/model layer (Noor + Ayesha; Salar support)    → report.json         ⬜ Week 4–8</w:t>
         <w:br/>
-        <w:t xml:space="preserve">    → Report generator (Noor)  → HTML / PDF          ⬜ Week 5</w:t>
+        <w:t xml:space="preserve">    → Report generator (Noor lead; team support)          → HTML / PDF          ⬜ Week 5–8</w:t>
         <w:br/>
-        <w:t xml:space="preserve">    → Axion UI (Ayesha)        → upload / dashboard  ⬜ Week 3–7</w:t>
+        <w:t xml:space="preserve">    → Axion UI (Ayesha lead; Noor + Salar support)        → upload / dashboard  ⬜ Week 3–7</w:t>
         <w:br/>
         <w:t xml:space="preserve">    → Auth + Records (team)    → per-user history    ⬜ Week 6–7</w:t>
+      </w:r>
+    </w:p>
+    <w:p>
+      <w:pPr>
+        <w:spacing w:before="120" w:after="120"/>
+      </w:pPr>
+      <w:r>
+        <w:rPr>
+          <w:color w:val="CCCCCC"/>
+          <w:sz w:val="16"/>
+        </w:rPr>
+        <w:t>────────────────────────────────────────────────────────────────────────</w:t>
+      </w:r>
+    </w:p>
+    <w:p>
+      <w:pPr>
+        <w:pStyle w:val="Heading2"/>
+      </w:pPr>
+      <w:r>
+        <w:t>Rule &amp; guideline collaboration matrix (mandatory)</w:t>
+      </w:r>
+    </w:p>
+    <w:p>
+      <w:r>
+        <w:t xml:space="preserve">All 30 rules and 30 guidelines are a </w:t>
+      </w:r>
+      <w:r>
+        <w:rPr>
+          <w:b/>
+        </w:rPr>
+        <w:t>team responsibility</w:t>
+      </w:r>
+      <w:r>
+        <w:t>. Ownership below means implementation lead, not solo ownership.</w:t>
+      </w:r>
+    </w:p>
+    <w:tbl>
+      <w:tblPr>
+        <w:tblStyle w:val="TableGrid"/>
+        <w:tblW w:type="auto" w:w="0"/>
+        <w:tblLayout w:type="autofit"/>
+        <w:tblLook w:firstColumn="1" w:firstRow="1" w:lastColumn="0" w:lastRow="0" w:noHBand="0" w:noVBand="1" w:val="04A0"/>
+      </w:tblPr>
+      <w:tblGrid>
+        <w:gridCol w:w="2340"/>
+        <w:gridCol w:w="2340"/>
+        <w:gridCol w:w="2340"/>
+        <w:gridCol w:w="2340"/>
+      </w:tblGrid>
+      <w:tr>
+        <w:tc>
+          <w:tcPr>
+            <w:tcW w:type="dxa" w:w="2340"/>
+            <w:shd w:val="clear" w:color="auto" w:fill="E8F4F1"/>
+          </w:tcPr>
+          <w:p>
+            <w:pPr>
+              <w:spacing w:after="40"/>
+            </w:pPr>
+            <w:r/>
+            <w:r>
+              <w:t>Block</w:t>
+            </w:r>
+          </w:p>
+        </w:tc>
+        <w:tc>
+          <w:tcPr>
+            <w:tcW w:type="dxa" w:w="2340"/>
+            <w:shd w:val="clear" w:color="auto" w:fill="E8F4F1"/>
+          </w:tcPr>
+          <w:p>
+            <w:pPr>
+              <w:spacing w:after="40"/>
+            </w:pPr>
+            <w:r/>
+            <w:r>
+              <w:t>Rule lead</w:t>
+            </w:r>
+          </w:p>
+        </w:tc>
+        <w:tc>
+          <w:tcPr>
+            <w:tcW w:type="dxa" w:w="2340"/>
+            <w:shd w:val="clear" w:color="auto" w:fill="E8F4F1"/>
+          </w:tcPr>
+          <w:p>
+            <w:pPr>
+              <w:spacing w:after="40"/>
+            </w:pPr>
+            <w:r/>
+            <w:r>
+              <w:t>Guideline validation lead</w:t>
+            </w:r>
+          </w:p>
+        </w:tc>
+        <w:tc>
+          <w:tcPr>
+            <w:tcW w:type="dxa" w:w="2340"/>
+            <w:shd w:val="clear" w:color="auto" w:fill="E8F4F1"/>
+          </w:tcPr>
+          <w:p>
+            <w:pPr>
+              <w:spacing w:after="40"/>
+            </w:pPr>
+            <w:r/>
+            <w:r>
+              <w:t>Required reviewers</w:t>
+            </w:r>
+          </w:p>
+        </w:tc>
+      </w:tr>
+      <w:tr>
+        <w:tc>
+          <w:tcPr>
+            <w:tcW w:type="dxa" w:w="2340"/>
+          </w:tcPr>
+          <w:p>
+            <w:pPr>
+              <w:spacing w:after="40"/>
+            </w:pPr>
+            <w:r/>
+            <w:r>
+              <w:rPr>
+                <w:b/>
+              </w:rPr>
+              <w:t>R01–R10 / G01–G10</w:t>
+            </w:r>
+          </w:p>
+        </w:tc>
+        <w:tc>
+          <w:tcPr>
+            <w:tcW w:type="dxa" w:w="2340"/>
+          </w:tcPr>
+          <w:p>
+            <w:pPr>
+              <w:spacing w:after="40"/>
+            </w:pPr>
+            <w:r/>
+            <w:r>
+              <w:t>Salar</w:t>
+            </w:r>
+          </w:p>
+        </w:tc>
+        <w:tc>
+          <w:tcPr>
+            <w:tcW w:type="dxa" w:w="2340"/>
+          </w:tcPr>
+          <w:p>
+            <w:pPr>
+              <w:spacing w:after="40"/>
+            </w:pPr>
+            <w:r/>
+            <w:r>
+              <w:t>Noor</w:t>
+            </w:r>
+          </w:p>
+        </w:tc>
+        <w:tc>
+          <w:tcPr>
+            <w:tcW w:type="dxa" w:w="2340"/>
+          </w:tcPr>
+          <w:p>
+            <w:pPr>
+              <w:spacing w:after="40"/>
+            </w:pPr>
+            <w:r/>
+            <w:r>
+              <w:t>Ayesha + Noor</w:t>
+            </w:r>
+          </w:p>
+        </w:tc>
+      </w:tr>
+      <w:tr>
+        <w:tc>
+          <w:tcPr>
+            <w:tcW w:type="dxa" w:w="2340"/>
+          </w:tcPr>
+          <w:p>
+            <w:pPr>
+              <w:spacing w:after="40"/>
+            </w:pPr>
+            <w:r/>
+            <w:r>
+              <w:rPr>
+                <w:b/>
+              </w:rPr>
+              <w:t>R11–R20 / G11–G20</w:t>
+            </w:r>
+          </w:p>
+        </w:tc>
+        <w:tc>
+          <w:tcPr>
+            <w:tcW w:type="dxa" w:w="2340"/>
+          </w:tcPr>
+          <w:p>
+            <w:pPr>
+              <w:spacing w:after="40"/>
+            </w:pPr>
+            <w:r/>
+            <w:r>
+              <w:t>Ayesha</w:t>
+            </w:r>
+          </w:p>
+        </w:tc>
+        <w:tc>
+          <w:tcPr>
+            <w:tcW w:type="dxa" w:w="2340"/>
+          </w:tcPr>
+          <w:p>
+            <w:pPr>
+              <w:spacing w:after="40"/>
+            </w:pPr>
+            <w:r/>
+            <w:r>
+              <w:t>Salar</w:t>
+            </w:r>
+          </w:p>
+        </w:tc>
+        <w:tc>
+          <w:tcPr>
+            <w:tcW w:type="dxa" w:w="2340"/>
+          </w:tcPr>
+          <w:p>
+            <w:pPr>
+              <w:spacing w:after="40"/>
+            </w:pPr>
+            <w:r/>
+            <w:r>
+              <w:t>Noor + Salar</w:t>
+            </w:r>
+          </w:p>
+        </w:tc>
+      </w:tr>
+      <w:tr>
+        <w:tc>
+          <w:tcPr>
+            <w:tcW w:type="dxa" w:w="2340"/>
+          </w:tcPr>
+          <w:p>
+            <w:pPr>
+              <w:spacing w:after="40"/>
+            </w:pPr>
+            <w:r/>
+            <w:r>
+              <w:rPr>
+                <w:b/>
+              </w:rPr>
+              <w:t>R21–R30 / G21–G30</w:t>
+            </w:r>
+          </w:p>
+        </w:tc>
+        <w:tc>
+          <w:tcPr>
+            <w:tcW w:type="dxa" w:w="2340"/>
+          </w:tcPr>
+          <w:p>
+            <w:pPr>
+              <w:spacing w:after="40"/>
+            </w:pPr>
+            <w:r/>
+            <w:r>
+              <w:t>Noor</w:t>
+            </w:r>
+          </w:p>
+        </w:tc>
+        <w:tc>
+          <w:tcPr>
+            <w:tcW w:type="dxa" w:w="2340"/>
+          </w:tcPr>
+          <w:p>
+            <w:pPr>
+              <w:spacing w:after="40"/>
+            </w:pPr>
+            <w:r/>
+            <w:r>
+              <w:t>Ayesha</w:t>
+            </w:r>
+          </w:p>
+        </w:tc>
+        <w:tc>
+          <w:tcPr>
+            <w:tcW w:type="dxa" w:w="2340"/>
+          </w:tcPr>
+          <w:p>
+            <w:pPr>
+              <w:spacing w:after="40"/>
+            </w:pPr>
+            <w:r/>
+            <w:r>
+              <w:t>Salar + Ayesha</w:t>
+            </w:r>
+          </w:p>
+        </w:tc>
+      </w:tr>
+    </w:tbl>
+    <w:p/>
+    <w:p>
+      <w:r>
+        <w:t>Minimum policy:</w:t>
+      </w:r>
+    </w:p>
+    <w:p>
+      <w:pPr>
+        <w:pStyle w:val="ListBullet"/>
+      </w:pPr>
+      <w:r>
+        <w:t>Every rule PR must include at least one reviewer from the other two interns.</w:t>
+      </w:r>
+    </w:p>
+    <w:p>
+      <w:pPr>
+        <w:pStyle w:val="ListBullet"/>
+      </w:pPr>
+      <w:r>
+        <w:t>Every rule must reference mapped guideline IDs (Gxx) in output/recommendation docs.</w:t>
+      </w:r>
+    </w:p>
+    <w:p>
+      <w:pPr>
+        <w:pStyle w:val="ListBullet"/>
+      </w:pPr>
+      <w:r>
+        <w:t>No rule/guideline block is considered complete unless all three have contributed code/tests/review.</w:t>
       </w:r>
     </w:p>
     <w:p>
@@ -1253,7 +1576,7 @@
             </w:pPr>
             <w:r/>
             <w:r>
-              <w:t>Rule engine R01–R10</w:t>
+              <w:t>Rule engine R01–R30</w:t>
             </w:r>
           </w:p>
         </w:tc>
@@ -1267,7 +1590,7 @@
             </w:pPr>
             <w:r/>
             <w:r>
-              <w:t>Week 3–4</w:t>
+              <w:t>Week 3–8</w:t>
             </w:r>
           </w:p>
         </w:tc>
@@ -1281,7 +1604,7 @@
             </w:pPr>
             <w:r/>
             <w:r>
-              <w:t>❌ Not started</w:t>
+              <w:t>🟡 In progress (R01–R10 implemented; R11–R30 pending)</w:t>
             </w:r>
           </w:p>
         </w:tc>
@@ -1355,7 +1678,7 @@
             </w:pPr>
             <w:r/>
             <w:r>
-              <w:t>Week 4–5</w:t>
+              <w:t>Week 4–8</w:t>
             </w:r>
           </w:p>
         </w:tc>
@@ -1369,7 +1692,7 @@
             </w:pPr>
             <w:r/>
             <w:r>
-              <w:t>❌ Not started</w:t>
+              <w:t>⬜ Team setup pending (Ayesha added to model workstream)</w:t>
             </w:r>
           </w:p>
         </w:tc>
@@ -2087,27 +2410,7 @@
             </w:pPr>
             <w:r/>
             <w:r>
-              <w:t xml:space="preserve">Implement </w:t>
-            </w:r>
-            <w:r>
-              <w:rPr>
-                <w:rFonts w:ascii="Consolas" w:hAnsi="Consolas"/>
-                <w:sz w:val="20"/>
-              </w:rPr>
-              <w:t>src/rules.py</w:t>
-            </w:r>
-            <w:r>
-              <w:t xml:space="preserve"> R01–R05; add </w:t>
-            </w:r>
-            <w:r>
-              <w:rPr>
-                <w:rFonts w:ascii="Consolas" w:hAnsi="Consolas"/>
-                <w:sz w:val="20"/>
-              </w:rPr>
-              <w:t>tests/fixtures/rules/</w:t>
-            </w:r>
-            <w:r>
-              <w:t xml:space="preserve"> with 10–15 controlled XML cases; run </w:t>
+              <w:t xml:space="preserve">Lead R01–R05 hardening + pair with Ayesha on R11/R12 design; run </w:t>
             </w:r>
             <w:r>
               <w:rPr>
@@ -2117,14 +2420,7 @@
               <w:t>validate_output.py</w:t>
             </w:r>
             <w:r>
-              <w:t xml:space="preserve"> on </w:t>
-            </w:r>
-            <w:r>
-              <w:rPr>
-                <w:rFonts w:ascii="Consolas" w:hAnsi="Consolas"/>
-                <w:sz w:val="20"/>
-              </w:rPr>
-              <w:t>violations.json</w:t>
+              <w:t xml:space="preserve"> on violations samples</w:t>
             </w:r>
           </w:p>
         </w:tc>
@@ -2138,7 +2434,7 @@
             </w:pPr>
             <w:r/>
             <w:r>
-              <w:t>R01–R05 detecting on test cases</w:t>
+              <w:t>R01–R05 stable + validation logs</w:t>
             </w:r>
           </w:p>
         </w:tc>
@@ -2171,17 +2467,7 @@
             </w:pPr>
             <w:r/>
             <w:r>
-              <w:t xml:space="preserve">Create </w:t>
-            </w:r>
-            <w:r>
-              <w:rPr>
-                <w:rFonts w:ascii="Consolas" w:hAnsi="Consolas"/>
-                <w:sz w:val="20"/>
-              </w:rPr>
-              <w:t>frontend/</w:t>
-            </w:r>
-            <w:r>
-              <w:t xml:space="preserve"> (Vite + React + Tailwind); build Sign Up, Log In, Upload pages per SRS Appendix F</w:t>
+              <w:t>Frontend scaffold + start R11–R12 detection stubs + join agent/model prompt experiments with Noor</w:t>
             </w:r>
           </w:p>
         </w:tc>
@@ -2195,7 +2481,7 @@
             </w:pPr>
             <w:r/>
             <w:r>
-              <w:t>Auth + upload UI (static or wired to stub API)</w:t>
+              <w:t>UI scaffold + first R11/R12 PR + model notes</w:t>
             </w:r>
           </w:p>
         </w:tc>
@@ -2228,7 +2514,7 @@
             </w:pPr>
             <w:r/>
             <w:r>
-              <w:t xml:space="preserve">Lock score formula (SDS §8.2); scaffold </w:t>
+              <w:t xml:space="preserve">Lock score formula; scaffold </w:t>
             </w:r>
             <w:r>
               <w:rPr>
@@ -2238,17 +2524,7 @@
               <w:t>src/agent.py</w:t>
             </w:r>
             <w:r>
-              <w:t xml:space="preserve">; expand FastAPI with </w:t>
-            </w:r>
-            <w:r>
-              <w:rPr>
-                <w:rFonts w:ascii="Consolas" w:hAnsi="Consolas"/>
-                <w:sz w:val="20"/>
-              </w:rPr>
-              <w:t>POST /api/v1/audit</w:t>
-            </w:r>
-            <w:r>
-              <w:t xml:space="preserve"> stub</w:t>
+              <w:t>; support R01–R05 review; define G01–G10 mapping checks</w:t>
             </w:r>
           </w:p>
         </w:tc>
@@ -2262,7 +2538,7 @@
             </w:pPr>
             <w:r/>
             <w:r>
-              <w:t>API contract + agent skeleton</w:t>
+              <w:t>API/agent skeleton + mapping checklist</w:t>
             </w:r>
           </w:p>
         </w:tc>
@@ -2385,17 +2661,7 @@
             </w:pPr>
             <w:r/>
             <w:r>
-              <w:t xml:space="preserve">R06–R10 in </w:t>
-            </w:r>
-            <w:r>
-              <w:rPr>
-                <w:rFonts w:ascii="Consolas" w:hAnsi="Consolas"/>
-                <w:sz w:val="20"/>
-              </w:rPr>
-              <w:t>rules.py</w:t>
-            </w:r>
-            <w:r>
-              <w:t>; Rico holdout batch parse start</w:t>
+              <w:t>Co-implement R13–R15 with team; start Rico holdout batch parse with rules</w:t>
             </w:r>
           </w:p>
         </w:tc>
@@ -2409,7 +2675,7 @@
             </w:pPr>
             <w:r/>
             <w:r>
-              <w:t>R01–R10 complete</w:t>
+              <w:t>R13–R15 PRs + holdout run logs</w:t>
             </w:r>
           </w:p>
         </w:tc>
@@ -2442,7 +2708,7 @@
             </w:pPr>
             <w:r/>
             <w:r>
-              <w:t>Dashboard page (score gauge, violations table); Issue Detail drawer</w:t>
+              <w:t>Dashboard page + co-implement R11–R15 tests; participate in model fine-tuning/prompt loop</w:t>
             </w:r>
           </w:p>
         </w:tc>
@@ -2456,7 +2722,7 @@
             </w:pPr>
             <w:r/>
             <w:r>
-              <w:t>Core dashboard UI</w:t>
+              <w:t>Core dashboard UI + R11–R15 tests + model eval notes</w:t>
             </w:r>
           </w:p>
         </w:tc>
@@ -2489,7 +2755,7 @@
             </w:pPr>
             <w:r/>
             <w:r>
-              <w:t>LLM prompts for agent; HTML report template; wire agent to violations</w:t>
+              <w:t>LLM prompts/agent wiring + co-implement R21 starter rules; review R11–R15</w:t>
             </w:r>
           </w:p>
         </w:tc>
@@ -2510,7 +2776,7 @@
               <w:t>report.json</w:t>
             </w:r>
             <w:r>
-              <w:t xml:space="preserve"> with agent fields</w:t>
+              <w:t xml:space="preserve"> draft + R21 starter PR</w:t>
             </w:r>
           </w:p>
         </w:tc>
@@ -2643,7 +2909,7 @@
             </w:pPr>
             <w:r/>
             <w:r>
-              <w:t>FastAPI audit pipeline orchestration; Docker frontend service in Compose</w:t>
+              <w:t>FastAPI audit pipeline orchestration; co-work on R16–R20 fixes</w:t>
             </w:r>
           </w:p>
         </w:tc>
@@ -2657,7 +2923,7 @@
             </w:pPr>
             <w:r/>
             <w:r>
-              <w:t>End-to-end API</w:t>
+              <w:t>End-to-end API + R16–R20 support</w:t>
             </w:r>
           </w:p>
         </w:tc>
@@ -2690,7 +2956,7 @@
             </w:pPr>
             <w:r/>
             <w:r>
-              <w:t>Audit Report page + Generate Report modal; PDF/HTML download buttons</w:t>
+              <w:t>Audit Report page + Generate Report modal; agent/model experiment branch updates</w:t>
             </w:r>
           </w:p>
         </w:tc>
@@ -2704,7 +2970,7 @@
             </w:pPr>
             <w:r/>
             <w:r>
-              <w:t>Report UI</w:t>
+              <w:t>Report UI + model experiment report</w:t>
             </w:r>
           </w:p>
         </w:tc>
@@ -2744,7 +3010,7 @@
               <w:t>src/report.py</w:t>
             </w:r>
             <w:r>
-              <w:t xml:space="preserve"> HTML/PDF generation; annotated screenshot boxes</w:t>
+              <w:t xml:space="preserve"> generation; integrate agent output with shared rule blocks</w:t>
             </w:r>
           </w:p>
         </w:tc>
@@ -2758,7 +3024,7 @@
             </w:pPr>
             <w:r/>
             <w:r>
-              <w:t>Downloadable audit report</w:t>
+              <w:t>Downloadable report + integrated agent flow</w:t>
             </w:r>
           </w:p>
         </w:tc>
@@ -2860,24 +3126,7 @@
             </w:pPr>
             <w:r/>
             <w:r>
-              <w:t>Auth backend (JWT); Records persistence (</w:t>
-            </w:r>
-            <w:r>
-              <w:rPr>
-                <w:rFonts w:ascii="Consolas" w:hAnsi="Consolas"/>
-                <w:sz w:val="20"/>
-              </w:rPr>
-              <w:t>outputs/records/</w:t>
-            </w:r>
-            <w:r>
-              <w:t xml:space="preserve">); </w:t>
-            </w:r>
-            <w:r>
-              <w:rPr>
-                <w:rFonts w:ascii="Consolas" w:hAnsi="Consolas"/>
-                <w:sz w:val="20"/>
-              </w:rPr>
-              <w:t>GET /api/v1/records</w:t>
+              <w:t>Auth backend (JWT); records persistence; contribute to R21–R25 implementation</w:t>
             </w:r>
           </w:p>
         </w:tc>
@@ -2891,7 +3140,7 @@
             </w:pPr>
             <w:r/>
             <w:r>
-              <w:t>Auth + Records API</w:t>
+              <w:t>Auth + Records API + R21–R25 code support</w:t>
             </w:r>
           </w:p>
         </w:tc>
@@ -2924,7 +3173,7 @@
             </w:pPr>
             <w:r/>
             <w:r>
-              <w:t>Auth screens (Forgot Password, OTP, Reset); Records page (Reports nav)</w:t>
+              <w:t>Auth screens + records page; contribute to R21–R25 tests; continue model experiments</w:t>
             </w:r>
           </w:p>
         </w:tc>
@@ -2938,7 +3187,7 @@
             </w:pPr>
             <w:r/>
             <w:r>
-              <w:t>Full Axion auth flow</w:t>
+              <w:t>Full Axion auth flow + R21–R25 tests</w:t>
             </w:r>
           </w:p>
         </w:tc>
@@ -2971,7 +3220,7 @@
             </w:pPr>
             <w:r/>
             <w:r>
-              <w:t>Run pipeline on 25–40 screens; manual validation (Correct/FP/Missed)</w:t>
+              <w:t>Run pipeline on 25–40 screens; manual validation; lead R26–R30 design and review</w:t>
             </w:r>
           </w:p>
         </w:tc>
@@ -2985,7 +3234,7 @@
             </w:pPr>
             <w:r/>
             <w:r>
-              <w:t>Evaluation spreadsheet</w:t>
+              <w:t>Evaluation sheet + R26–R30 design doc</w:t>
             </w:r>
           </w:p>
         </w:tc>
@@ -3107,7 +3356,7 @@
             </w:pPr>
             <w:r/>
             <w:r>
-              <w:t>Fix rule false positives; R11–R20 if time (Should Have)</w:t>
+              <w:t>Fix rule false positives; complete assigned R-block gaps</w:t>
             </w:r>
           </w:p>
         </w:tc>
@@ -3121,7 +3370,7 @@
             </w:pPr>
             <w:r/>
             <w:r>
-              <w:t>Stable rule engine</w:t>
+              <w:t>Stable rule engine across all 30 rules</w:t>
             </w:r>
           </w:p>
         </w:tc>
@@ -3154,7 +3403,7 @@
             </w:pPr>
             <w:r/>
             <w:r>
-              <w:t>UI polish, error states, loading animations</w:t>
+              <w:t>UI polish; finalize model/prompt comparison notes; close R-block test gaps</w:t>
             </w:r>
           </w:p>
         </w:tc>
@@ -3168,7 +3417,7 @@
             </w:pPr>
             <w:r/>
             <w:r>
-              <w:t>Production-quality Axion</w:t>
+              <w:t>Production-quality Axion + model comparison</w:t>
             </w:r>
           </w:p>
         </w:tc>
@@ -3201,7 +3450,7 @@
             </w:pPr>
             <w:r/>
             <w:r>
-              <w:t>Rico holdout evaluation (unseen); compile evaluation summary</w:t>
+              <w:t>Rico holdout evaluation; compile rule-wise and guideline-wise summary</w:t>
             </w:r>
           </w:p>
         </w:tc>
@@ -3215,7 +3464,7 @@
             </w:pPr>
             <w:r/>
             <w:r>
-              <w:t>Holdout results doc</w:t>
+              <w:t>Holdout results + G01–G30 coverage report</w:t>
             </w:r>
           </w:p>
         </w:tc>
@@ -3338,7 +3587,7 @@
             </w:pPr>
             <w:r/>
             <w:r>
-              <w:t>Module README</w:t>
+              <w:t>Rule-engine handoff docs</w:t>
             </w:r>
           </w:p>
         </w:tc>
@@ -3371,7 +3620,7 @@
             </w:pPr>
             <w:r/>
             <w:r>
-              <w:t>Figma + React UI documentation</w:t>
+              <w:t>Figma + React UI + model experiment documentation</w:t>
             </w:r>
           </w:p>
         </w:tc>
@@ -3385,7 +3634,7 @@
             </w:pPr>
             <w:r/>
             <w:r>
-              <w:t>UI handoff doc</w:t>
+              <w:t>UI + agentic/model handoff doc</w:t>
             </w:r>
           </w:p>
         </w:tc>
@@ -3432,7 +3681,7 @@
             </w:pPr>
             <w:r/>
             <w:r>
-              <w:t>Final report + demo</w:t>
+              <w:t>Final report + demo with 30/30 coverage</w:t>
             </w:r>
           </w:p>
         </w:tc>
@@ -3563,7 +3812,7 @@
             </w:pPr>
             <w:r/>
             <w:r>
-              <w:t>R11–R20 · batch API · annotated screenshot regions in UI</w:t>
+              <w:t>R11–R20 · batch API · annotated screenshot regions in UI · Ayesha model/prompt experiments integrated</w:t>
             </w:r>
           </w:p>
         </w:tc>
@@ -3596,7 +3845,7 @@
             </w:pPr>
             <w:r/>
             <w:r>
-              <w:t>R21–R30 · R09 contrast (CV) · CNN classifier · click-to-highlight in HTML report · benchmark dataset export</w:t>
+              <w:t>R21–R30 · R09 contrast (CV) · CNN classifier / lightweight model training · click-to-highlight in HTML report · benchmark dataset export</w:t>
             </w:r>
           </w:p>
         </w:tc>
@@ -4043,7 +4292,7 @@
             </w:pPr>
             <w:r/>
             <w:r>
-              <w:t>Rule engine</w:t>
+              <w:t>Rule engine (R01–R30)</w:t>
             </w:r>
           </w:p>
         </w:tc>
@@ -4057,7 +4306,7 @@
             </w:pPr>
             <w:r/>
             <w:r>
-              <w:t>Salar</w:t>
+              <w:t>Salar + Ayesha + Noor (split by blocks)</w:t>
             </w:r>
           </w:p>
         </w:tc>
@@ -4101,7 +4350,7 @@
             </w:pPr>
             <w:r/>
             <w:r>
-              <w:t>Agent</w:t>
+              <w:t>Agent / model layer</w:t>
             </w:r>
           </w:p>
         </w:tc>
@@ -4115,7 +4364,7 @@
             </w:pPr>
             <w:r/>
             <w:r>
-              <w:t>Noor</w:t>
+              <w:t>Noor + Ayesha (Salar support)</w:t>
             </w:r>
           </w:p>
         </w:tc>
@@ -4560,7 +4809,7 @@
             </w:pPr>
             <w:r/>
             <w:r>
-              <w:t>LLM model</w:t>
+              <w:t>LLM/model choice (+ training strategy)</w:t>
             </w:r>
           </w:p>
         </w:tc>
@@ -4574,7 +4823,7 @@
             </w:pPr>
             <w:r/>
             <w:r>
-              <w:t>Noor</w:t>
+              <w:t>Noor + Ayesha</w:t>
             </w:r>
           </w:p>
         </w:tc>
@@ -4588,14 +4837,7 @@
             </w:pPr>
             <w:r/>
             <w:r>
-              <w:rPr>
-                <w:rFonts w:ascii="Consolas" w:hAnsi="Consolas"/>
-                <w:sz w:val="20"/>
-              </w:rPr>
-              <w:t>gpt-4o-mini</w:t>
-            </w:r>
-            <w:r>
-              <w:t xml:space="preserve"> (cost)</w:t>
+              <w:t>pick base model + tuning/prompt strategy by Week 4</w:t>
             </w:r>
           </w:p>
         </w:tc>
@@ -5185,10 +5427,7 @@
               <w:rPr>
                 <w:b/>
               </w:rPr>
-              <w:t>Salar owns all R01–R30</w:t>
-            </w:r>
-            <w:r>
-              <w:t xml:space="preserve"> (Ayesha focuses UI/schemas)</w:t>
+              <w:t>All three share R01–R30 and G01–G30 by defined blocks</w:t>
             </w:r>
           </w:p>
         </w:tc>

</xml_diff>